<commit_message>
feat: se agrego un manual tecnico y un documento de requerimientos
</commit_message>
<xml_diff>
--- a/Docs/Manual_Tecnico_API_Sistema_Supermercado.docx
+++ b/Docs/Manual_Tecnico_API_Sistema_Supermercado.docx
@@ -3114,7 +3114,39 @@
         <w:pageBreakBefore/>
       </w:pPr>
       <w:r>
-        <w:t xml:space="preserve">4. Base de datos</w:t>
+        <w:t xml:space="preserve">4. Diseño del sistema</w:t>
+      </w:r>
+    </w:p>
+    <w:p>
+      <w:pPr>
+        <w:spacing w:after="120" w:line="276"/>
+      </w:pPr>
+      <w:r>
+        <w:t xml:space="preserve">Este capítulo muestra la estructura de clases y los flujos principales de la API con diagramas UML. El código fuente de cada diagrama está en </w:t>
+      </w:r>
+      <w:r>
+        <w:rPr>
+          <w:rFonts w:ascii="Consolas" w:cs="Consolas" w:eastAsia="Consolas" w:hAnsi="Consolas"/>
+          <w:color w:val="7A2E0E"/>
+          <w:sz w:val="19"/>
+          <w:szCs w:val="19"/>
+        </w:rPr>
+        <w:t xml:space="preserve">Docs/diagramas/*.puml</w:t>
+      </w:r>
+      <w:r>
+        <w:t xml:space="preserve"> (PlantUML) y las imágenes en </w:t>
+      </w:r>
+      <w:r>
+        <w:rPr>
+          <w:rFonts w:ascii="Consolas" w:cs="Consolas" w:eastAsia="Consolas" w:hAnsi="Consolas"/>
+          <w:color w:val="7A2E0E"/>
+          <w:sz w:val="19"/>
+          <w:szCs w:val="19"/>
+        </w:rPr>
+        <w:t xml:space="preserve">Docs/diagramas/png/</w:t>
+      </w:r>
+      <w:r>
+        <w:t xml:space="preserve">.</w:t>
       </w:r>
     </w:p>
     <w:p>
@@ -3122,7 +3154,7 @@
         <w:pStyle w:val="Heading2"/>
       </w:pPr>
       <w:r>
-        <w:t xml:space="preserve">4.1 Generalidades</w:t>
+        <w:t xml:space="preserve">4.1 Diagramas de clases</w:t>
       </w:r>
     </w:p>
     <w:p>
@@ -3130,6 +3162,877 @@
         <w:spacing w:after="120" w:line="276"/>
       </w:pPr>
       <w:r>
+        <w:t xml:space="preserve">Los 14 módulos siguen el mismo patrón por capas. La Figura 1 lo muestra con el módulo Categoría: el controlador depende solo de la interfaz del servicio; el servicio valida, audita, obtiene el usuario actual y delega en el repositorio, que ejecuta los procedimientos almacenados.</w:t>
+      </w:r>
+    </w:p>
+    <w:p>
+      <w:pPr>
+        <w:keepNext/>
+        <w:spacing w:after="60" w:before="120"/>
+        <w:jc w:val="center"/>
+      </w:pPr>
+      <w:r>
+        <w:drawing>
+          <wp:inline distT="0" distB="0" distL="0" distR="0">
+            <wp:extent cx="6096000" cy="6667500"/>
+            <wp:effectExtent t="0" r="0" b="0" l="0"/>
+            <wp:docPr id="1" name="" descr="" title=""/>
+            <wp:cNvGraphicFramePr>
+              <a:graphicFrameLocks xmlns:a="http://schemas.openxmlformats.org/drawingml/2006/main" noChangeAspect="1"/>
+            </wp:cNvGraphicFramePr>
+            <a:graphic xmlns:a="http://schemas.openxmlformats.org/drawingml/2006/main">
+              <a:graphicData uri="http://schemas.openxmlformats.org/drawingml/2006/picture">
+                <pic:pic xmlns:pic="http://schemas.openxmlformats.org/drawingml/2006/picture">
+                  <pic:nvPicPr>
+                    <pic:cNvPr id="0" name="" descr=""/>
+                    <pic:cNvPicPr>
+                      <a:picLocks noChangeAspect="1" noChangeArrowheads="1"/>
+                    </pic:cNvPicPr>
+                  </pic:nvPicPr>
+                  <pic:blipFill>
+                    <a:blip r:embed="rId9" cstate="none"/>
+                    <a:srcRect/>
+                    <a:stretch>
+                      <a:fillRect/>
+                    </a:stretch>
+                  </pic:blipFill>
+                  <pic:spPr bwMode="auto">
+                    <a:xfrm>
+                      <a:off x="0" y="0"/>
+                      <a:ext cx="6096000" cy="6667500"/>
+                    </a:xfrm>
+                    <a:prstGeom prst="rect">
+                      <a:avLst/>
+                    </a:prstGeom>
+                  </pic:spPr>
+                </pic:pic>
+              </a:graphicData>
+            </a:graphic>
+          </wp:inline>
+        </w:drawing>
+      </w:r>
+    </w:p>
+    <w:p>
+      <w:pPr>
+        <w:spacing w:after="200"/>
+        <w:jc w:val="center"/>
+      </w:pPr>
+      <w:r>
+        <w:rPr>
+          <w:i/>
+          <w:iCs/>
+          <w:color w:val="595959"/>
+          <w:sz w:val="18"/>
+          <w:szCs w:val="18"/>
+        </w:rPr>
+        <w:t xml:space="preserve">Figura 1. Patrón de un módulo (Categoría).</w:t>
+      </w:r>
+    </w:p>
+    <w:p>
+      <w:pPr>
+        <w:spacing w:after="120" w:line="276"/>
+      </w:pPr>
+      <w:r>
+        <w:t xml:space="preserve">Los componentes transversales se comparten entre todos los módulos: auditoría, contexto de la petición y usuario actual (Figura 2); generación de tokens, cifrado de claves y análisis con IA (Figura 3).</w:t>
+      </w:r>
+    </w:p>
+    <w:p>
+      <w:pPr>
+        <w:keepNext/>
+        <w:spacing w:after="60" w:before="120"/>
+        <w:jc w:val="center"/>
+      </w:pPr>
+      <w:r>
+        <w:drawing>
+          <wp:inline distT="0" distB="0" distL="0" distR="0">
+            <wp:extent cx="4448175" cy="4953000"/>
+            <wp:effectExtent t="0" r="0" b="0" l="0"/>
+            <wp:docPr id="1" name="" descr="" title=""/>
+            <wp:cNvGraphicFramePr>
+              <a:graphicFrameLocks xmlns:a="http://schemas.openxmlformats.org/drawingml/2006/main" noChangeAspect="1"/>
+            </wp:cNvGraphicFramePr>
+            <a:graphic xmlns:a="http://schemas.openxmlformats.org/drawingml/2006/main">
+              <a:graphicData uri="http://schemas.openxmlformats.org/drawingml/2006/picture">
+                <pic:pic xmlns:pic="http://schemas.openxmlformats.org/drawingml/2006/picture">
+                  <pic:nvPicPr>
+                    <pic:cNvPr id="0" name="" descr=""/>
+                    <pic:cNvPicPr>
+                      <a:picLocks noChangeAspect="1" noChangeArrowheads="1"/>
+                    </pic:cNvPicPr>
+                  </pic:nvPicPr>
+                  <pic:blipFill>
+                    <a:blip r:embed="rId10" cstate="none"/>
+                    <a:srcRect/>
+                    <a:stretch>
+                      <a:fillRect/>
+                    </a:stretch>
+                  </pic:blipFill>
+                  <pic:spPr bwMode="auto">
+                    <a:xfrm>
+                      <a:off x="0" y="0"/>
+                      <a:ext cx="4448175" cy="4953000"/>
+                    </a:xfrm>
+                    <a:prstGeom prst="rect">
+                      <a:avLst/>
+                    </a:prstGeom>
+                  </pic:spPr>
+                </pic:pic>
+              </a:graphicData>
+            </a:graphic>
+          </wp:inline>
+        </w:drawing>
+      </w:r>
+    </w:p>
+    <w:p>
+      <w:pPr>
+        <w:spacing w:after="200"/>
+        <w:jc w:val="center"/>
+      </w:pPr>
+      <w:r>
+        <w:rPr>
+          <w:i/>
+          <w:iCs/>
+          <w:color w:val="595959"/>
+          <w:sz w:val="18"/>
+          <w:szCs w:val="18"/>
+        </w:rPr>
+        <w:t xml:space="preserve">Figura 2. Auditoría y manejo de errores.</w:t>
+      </w:r>
+    </w:p>
+    <w:p>
+      <w:pPr>
+        <w:keepNext/>
+        <w:spacing w:after="60" w:before="120"/>
+        <w:jc w:val="center"/>
+      </w:pPr>
+      <w:r>
+        <w:drawing>
+          <wp:inline distT="0" distB="0" distL="0" distR="0">
+            <wp:extent cx="6096000" cy="2762250"/>
+            <wp:effectExtent t="0" r="0" b="0" l="0"/>
+            <wp:docPr id="1" name="" descr="" title=""/>
+            <wp:cNvGraphicFramePr>
+              <a:graphicFrameLocks xmlns:a="http://schemas.openxmlformats.org/drawingml/2006/main" noChangeAspect="1"/>
+            </wp:cNvGraphicFramePr>
+            <a:graphic xmlns:a="http://schemas.openxmlformats.org/drawingml/2006/main">
+              <a:graphicData uri="http://schemas.openxmlformats.org/drawingml/2006/picture">
+                <pic:pic xmlns:pic="http://schemas.openxmlformats.org/drawingml/2006/picture">
+                  <pic:nvPicPr>
+                    <pic:cNvPr id="0" name="" descr=""/>
+                    <pic:cNvPicPr>
+                      <a:picLocks noChangeAspect="1" noChangeArrowheads="1"/>
+                    </pic:cNvPicPr>
+                  </pic:nvPicPr>
+                  <pic:blipFill>
+                    <a:blip r:embed="rId11" cstate="none"/>
+                    <a:srcRect/>
+                    <a:stretch>
+                      <a:fillRect/>
+                    </a:stretch>
+                  </pic:blipFill>
+                  <pic:spPr bwMode="auto">
+                    <a:xfrm>
+                      <a:off x="0" y="0"/>
+                      <a:ext cx="6096000" cy="2762250"/>
+                    </a:xfrm>
+                    <a:prstGeom prst="rect">
+                      <a:avLst/>
+                    </a:prstGeom>
+                  </pic:spPr>
+                </pic:pic>
+              </a:graphicData>
+            </a:graphic>
+          </wp:inline>
+        </w:drawing>
+      </w:r>
+    </w:p>
+    <w:p>
+      <w:pPr>
+        <w:spacing w:after="200"/>
+        <w:jc w:val="center"/>
+      </w:pPr>
+      <w:r>
+        <w:rPr>
+          <w:i/>
+          <w:iCs/>
+          <w:color w:val="595959"/>
+          <w:sz w:val="18"/>
+          <w:szCs w:val="18"/>
+        </w:rPr>
+        <w:t xml:space="preserve">Figura 3. Seguridad e inteligencia artificial.</w:t>
+      </w:r>
+    </w:p>
+    <w:p>
+      <w:pPr>
+        <w:pStyle w:val="Heading2"/>
+      </w:pPr>
+      <w:r>
+        <w:t xml:space="preserve">4.2 Diagramas de secuencia</w:t>
+      </w:r>
+    </w:p>
+    <w:p>
+      <w:pPr>
+        <w:spacing w:after="120" w:line="276"/>
+      </w:pPr>
+      <w:r>
+        <w:rPr>
+          <w:b/>
+          <w:bCs/>
+        </w:rPr>
+        <w:t xml:space="preserve">Inicio de sesión.</w:t>
+      </w:r>
+      <w:r>
+        <w:t xml:space="preserve"> Valida los datos, cifra la clave con SHA-256, consulta </w:t>
+      </w:r>
+      <w:r>
+        <w:rPr>
+          <w:rFonts w:ascii="Consolas" w:cs="Consolas" w:eastAsia="Consolas" w:hAnsi="Consolas"/>
+          <w:color w:val="7A2E0E"/>
+          <w:sz w:val="19"/>
+          <w:szCs w:val="19"/>
+        </w:rPr>
+        <w:t xml:space="preserve">PA_INICIAR_SESION</w:t>
+      </w:r>
+      <w:r>
+        <w:t xml:space="preserve">, verifica que el usuario esté activo, obtiene sus menús y emite el token JWT.</w:t>
+      </w:r>
+    </w:p>
+    <w:p>
+      <w:pPr>
+        <w:keepNext/>
+        <w:spacing w:after="60" w:before="120"/>
+        <w:jc w:val="center"/>
+      </w:pPr>
+      <w:r>
+        <w:drawing>
+          <wp:inline distT="0" distB="0" distL="0" distR="0">
+            <wp:extent cx="6096000" cy="7010400"/>
+            <wp:effectExtent t="0" r="0" b="0" l="0"/>
+            <wp:docPr id="1" name="" descr="" title=""/>
+            <wp:cNvGraphicFramePr>
+              <a:graphicFrameLocks xmlns:a="http://schemas.openxmlformats.org/drawingml/2006/main" noChangeAspect="1"/>
+            </wp:cNvGraphicFramePr>
+            <a:graphic xmlns:a="http://schemas.openxmlformats.org/drawingml/2006/main">
+              <a:graphicData uri="http://schemas.openxmlformats.org/drawingml/2006/picture">
+                <pic:pic xmlns:pic="http://schemas.openxmlformats.org/drawingml/2006/picture">
+                  <pic:nvPicPr>
+                    <pic:cNvPr id="0" name="" descr=""/>
+                    <pic:cNvPicPr>
+                      <a:picLocks noChangeAspect="1" noChangeArrowheads="1"/>
+                    </pic:cNvPicPr>
+                  </pic:nvPicPr>
+                  <pic:blipFill>
+                    <a:blip r:embed="rId12" cstate="none"/>
+                    <a:srcRect/>
+                    <a:stretch>
+                      <a:fillRect/>
+                    </a:stretch>
+                  </pic:blipFill>
+                  <pic:spPr bwMode="auto">
+                    <a:xfrm>
+                      <a:off x="0" y="0"/>
+                      <a:ext cx="6096000" cy="7010400"/>
+                    </a:xfrm>
+                    <a:prstGeom prst="rect">
+                      <a:avLst/>
+                    </a:prstGeom>
+                  </pic:spPr>
+                </pic:pic>
+              </a:graphicData>
+            </a:graphic>
+          </wp:inline>
+        </w:drawing>
+      </w:r>
+    </w:p>
+    <w:p>
+      <w:pPr>
+        <w:spacing w:after="200"/>
+        <w:jc w:val="center"/>
+      </w:pPr>
+      <w:r>
+        <w:rPr>
+          <w:i/>
+          <w:iCs/>
+          <w:color w:val="595959"/>
+          <w:sz w:val="18"/>
+          <w:szCs w:val="18"/>
+        </w:rPr>
+        <w:t xml:space="preserve">Figura 4. Inicio de sesión.</w:t>
+      </w:r>
+    </w:p>
+    <w:p>
+      <w:pPr>
+        <w:spacing w:after="120" w:line="276"/>
+      </w:pPr>
+      <w:r>
+        <w:rPr>
+          <w:b/>
+          <w:bCs/>
+        </w:rPr>
+        <w:t xml:space="preserve">Registrar venta.</w:t>
+      </w:r>
+      <w:r>
+        <w:t xml:space="preserve"> Es el flujo transaccional más importante. El repositorio arma el detalle como parámetro tabla y el procedimiento guarda cabecera, detalle y descuento de stock en una sola transacción.</w:t>
+      </w:r>
+    </w:p>
+    <w:p>
+      <w:pPr>
+        <w:keepNext/>
+        <w:spacing w:after="60" w:before="120"/>
+        <w:jc w:val="center"/>
+      </w:pPr>
+      <w:r>
+        <w:drawing>
+          <wp:inline distT="0" distB="0" distL="0" distR="0">
+            <wp:extent cx="6096000" cy="7877175"/>
+            <wp:effectExtent t="0" r="0" b="0" l="0"/>
+            <wp:docPr id="1" name="" descr="" title=""/>
+            <wp:cNvGraphicFramePr>
+              <a:graphicFrameLocks xmlns:a="http://schemas.openxmlformats.org/drawingml/2006/main" noChangeAspect="1"/>
+            </wp:cNvGraphicFramePr>
+            <a:graphic xmlns:a="http://schemas.openxmlformats.org/drawingml/2006/main">
+              <a:graphicData uri="http://schemas.openxmlformats.org/drawingml/2006/picture">
+                <pic:pic xmlns:pic="http://schemas.openxmlformats.org/drawingml/2006/picture">
+                  <pic:nvPicPr>
+                    <pic:cNvPr id="0" name="" descr=""/>
+                    <pic:cNvPicPr>
+                      <a:picLocks noChangeAspect="1" noChangeArrowheads="1"/>
+                    </pic:cNvPicPr>
+                  </pic:nvPicPr>
+                  <pic:blipFill>
+                    <a:blip r:embed="rId13" cstate="none"/>
+                    <a:srcRect/>
+                    <a:stretch>
+                      <a:fillRect/>
+                    </a:stretch>
+                  </pic:blipFill>
+                  <pic:spPr bwMode="auto">
+                    <a:xfrm>
+                      <a:off x="0" y="0"/>
+                      <a:ext cx="6096000" cy="7877175"/>
+                    </a:xfrm>
+                    <a:prstGeom prst="rect">
+                      <a:avLst/>
+                    </a:prstGeom>
+                  </pic:spPr>
+                </pic:pic>
+              </a:graphicData>
+            </a:graphic>
+          </wp:inline>
+        </w:drawing>
+      </w:r>
+    </w:p>
+    <w:p>
+      <w:pPr>
+        <w:spacing w:after="200"/>
+        <w:jc w:val="center"/>
+      </w:pPr>
+      <w:r>
+        <w:rPr>
+          <w:i/>
+          <w:iCs/>
+          <w:color w:val="595959"/>
+          <w:sz w:val="18"/>
+          <w:szCs w:val="18"/>
+        </w:rPr>
+        <w:t xml:space="preserve">Figura 5. Registrar venta.</w:t>
+      </w:r>
+    </w:p>
+    <w:p>
+      <w:pPr>
+        <w:spacing w:after="120" w:line="276"/>
+      </w:pPr>
+      <w:r>
+        <w:t xml:space="preserve">Observaciones: </w:t>
+      </w:r>
+      <w:r>
+        <w:rPr>
+          <w:rFonts w:ascii="Consolas" w:cs="Consolas" w:eastAsia="Consolas" w:hAnsi="Consolas"/>
+          <w:color w:val="7A2E0E"/>
+          <w:sz w:val="19"/>
+          <w:szCs w:val="19"/>
+        </w:rPr>
+        <w:t xml:space="preserve">VentaRepository</w:t>
+      </w:r>
+      <w:r>
+        <w:t xml:space="preserve"> (y </w:t>
+      </w:r>
+      <w:r>
+        <w:rPr>
+          <w:rFonts w:ascii="Consolas" w:cs="Consolas" w:eastAsia="Consolas" w:hAnsi="Consolas"/>
+          <w:color w:val="7A2E0E"/>
+          <w:sz w:val="19"/>
+          <w:szCs w:val="19"/>
+        </w:rPr>
+        <w:t xml:space="preserve">CompraRepository</w:t>
+      </w:r>
+      <w:r>
+        <w:t xml:space="preserve">) llaman a </w:t>
+      </w:r>
+      <w:r>
+        <w:rPr>
+          <w:rFonts w:ascii="Consolas" w:cs="Consolas" w:eastAsia="Consolas" w:hAnsi="Consolas"/>
+          <w:color w:val="7A2E0E"/>
+          <w:sz w:val="19"/>
+          <w:szCs w:val="19"/>
+        </w:rPr>
+        <w:t xml:space="preserve">ObtenerNumeroDocumentoAsync()</w:t>
+      </w:r>
+      <w:r>
+        <w:t xml:space="preserve"> pero el valor no se usa; se guarda el número que envía el frontend (obtenido antes con </w:t>
+      </w:r>
+      <w:r>
+        <w:rPr>
+          <w:rFonts w:ascii="Consolas" w:cs="Consolas" w:eastAsia="Consolas" w:hAnsi="Consolas"/>
+          <w:color w:val="7A2E0E"/>
+          <w:sz w:val="19"/>
+          <w:szCs w:val="19"/>
+        </w:rPr>
+        <w:t xml:space="preserve">GET /api/venta/numero-documento</w:t>
+      </w:r>
+      <w:r>
+        <w:t xml:space="preserve">), por lo que dos ventas simultáneas podrían recibir el mismo número. Si falta stock, la respuesta es el mensaje genérico «Error al registrar.»; conviene devolver un mensaje específico.</w:t>
+      </w:r>
+    </w:p>
+    <w:p>
+      <w:pPr>
+        <w:spacing w:after="120" w:line="276"/>
+      </w:pPr>
+      <w:r>
+        <w:rPr>
+          <w:b/>
+          <w:bCs/>
+        </w:rPr>
+        <w:t xml:space="preserve">Análisis con IA.</w:t>
+      </w:r>
+      <w:r>
+        <w:t xml:space="preserve"> La pregunta se clasifica con expresiones regulares; solo los tipos Producto, Categoría, Cliente, Comprado y Vendido consultan datos y llaman a Ollama. Proveedor y Sucursal se detectan pero todavía no tienen consulta asociada.</w:t>
+      </w:r>
+    </w:p>
+    <w:p>
+      <w:pPr>
+        <w:keepNext/>
+        <w:spacing w:after="60" w:before="120"/>
+        <w:jc w:val="center"/>
+      </w:pPr>
+      <w:r>
+        <w:drawing>
+          <wp:inline distT="0" distB="0" distL="0" distR="0">
+            <wp:extent cx="6096000" cy="6381750"/>
+            <wp:effectExtent t="0" r="0" b="0" l="0"/>
+            <wp:docPr id="1" name="" descr="" title=""/>
+            <wp:cNvGraphicFramePr>
+              <a:graphicFrameLocks xmlns:a="http://schemas.openxmlformats.org/drawingml/2006/main" noChangeAspect="1"/>
+            </wp:cNvGraphicFramePr>
+            <a:graphic xmlns:a="http://schemas.openxmlformats.org/drawingml/2006/main">
+              <a:graphicData uri="http://schemas.openxmlformats.org/drawingml/2006/picture">
+                <pic:pic xmlns:pic="http://schemas.openxmlformats.org/drawingml/2006/picture">
+                  <pic:nvPicPr>
+                    <pic:cNvPr id="0" name="" descr=""/>
+                    <pic:cNvPicPr>
+                      <a:picLocks noChangeAspect="1" noChangeArrowheads="1"/>
+                    </pic:cNvPicPr>
+                  </pic:nvPicPr>
+                  <pic:blipFill>
+                    <a:blip r:embed="rId14" cstate="none"/>
+                    <a:srcRect/>
+                    <a:stretch>
+                      <a:fillRect/>
+                    </a:stretch>
+                  </pic:blipFill>
+                  <pic:spPr bwMode="auto">
+                    <a:xfrm>
+                      <a:off x="0" y="0"/>
+                      <a:ext cx="6096000" cy="6381750"/>
+                    </a:xfrm>
+                    <a:prstGeom prst="rect">
+                      <a:avLst/>
+                    </a:prstGeom>
+                  </pic:spPr>
+                </pic:pic>
+              </a:graphicData>
+            </a:graphic>
+          </wp:inline>
+        </w:drawing>
+      </w:r>
+    </w:p>
+    <w:p>
+      <w:pPr>
+        <w:spacing w:after="200"/>
+        <w:jc w:val="center"/>
+      </w:pPr>
+      <w:r>
+        <w:rPr>
+          <w:i/>
+          <w:iCs/>
+          <w:color w:val="595959"/>
+          <w:sz w:val="18"/>
+          <w:szCs w:val="18"/>
+        </w:rPr>
+        <w:t xml:space="preserve">Figura 6. Análisis con IA.</w:t>
+      </w:r>
+    </w:p>
+    <w:p>
+      <w:pPr>
+        <w:spacing w:after="120" w:line="276"/>
+      </w:pPr>
+      <w:r>
+        <w:t xml:space="preserve">Observación: si Ollama falla, </w:t>
+      </w:r>
+      <w:r>
+        <w:rPr>
+          <w:rFonts w:ascii="Consolas" w:cs="Consolas" w:eastAsia="Consolas" w:hAnsi="Consolas"/>
+          <w:color w:val="7A2E0E"/>
+          <w:sz w:val="19"/>
+          <w:szCs w:val="19"/>
+        </w:rPr>
+        <w:t xml:space="preserve">OllamaClient</w:t>
+      </w:r>
+      <w:r>
+        <w:t xml:space="preserve"> devuelve el texto del error y la API responde 200 con ese texto en </w:t>
+      </w:r>
+      <w:r>
+        <w:rPr>
+          <w:rFonts w:ascii="Consolas" w:cs="Consolas" w:eastAsia="Consolas" w:hAnsi="Consolas"/>
+          <w:color w:val="7A2E0E"/>
+          <w:sz w:val="19"/>
+          <w:szCs w:val="19"/>
+        </w:rPr>
+        <w:t xml:space="preserve">Data</w:t>
+      </w:r>
+      <w:r>
+        <w:t xml:space="preserve">.</w:t>
+      </w:r>
+    </w:p>
+    <w:p>
+      <w:pPr>
+        <w:spacing w:after="120" w:line="276"/>
+      </w:pPr>
+      <w:r>
+        <w:rPr>
+          <w:b/>
+          <w:bCs/>
+        </w:rPr>
+        <w:t xml:space="preserve">Error no controlado.</w:t>
+      </w:r>
+      <w:r>
+        <w:t xml:space="preserve"> El servicio audita la excepción y la relanza; el middleware la vuelve a registrar y responde 500 con un código rastreable.</w:t>
+      </w:r>
+    </w:p>
+    <w:p>
+      <w:pPr>
+        <w:keepNext/>
+        <w:spacing w:after="60" w:before="120"/>
+        <w:jc w:val="center"/>
+      </w:pPr>
+      <w:r>
+        <w:drawing>
+          <wp:inline distT="0" distB="0" distL="0" distR="0">
+            <wp:extent cx="6096000" cy="5495925"/>
+            <wp:effectExtent t="0" r="0" b="0" l="0"/>
+            <wp:docPr id="1" name="" descr="" title=""/>
+            <wp:cNvGraphicFramePr>
+              <a:graphicFrameLocks xmlns:a="http://schemas.openxmlformats.org/drawingml/2006/main" noChangeAspect="1"/>
+            </wp:cNvGraphicFramePr>
+            <a:graphic xmlns:a="http://schemas.openxmlformats.org/drawingml/2006/main">
+              <a:graphicData uri="http://schemas.openxmlformats.org/drawingml/2006/picture">
+                <pic:pic xmlns:pic="http://schemas.openxmlformats.org/drawingml/2006/picture">
+                  <pic:nvPicPr>
+                    <pic:cNvPr id="0" name="" descr=""/>
+                    <pic:cNvPicPr>
+                      <a:picLocks noChangeAspect="1" noChangeArrowheads="1"/>
+                    </pic:cNvPicPr>
+                  </pic:nvPicPr>
+                  <pic:blipFill>
+                    <a:blip r:embed="rId15" cstate="none"/>
+                    <a:srcRect/>
+                    <a:stretch>
+                      <a:fillRect/>
+                    </a:stretch>
+                  </pic:blipFill>
+                  <pic:spPr bwMode="auto">
+                    <a:xfrm>
+                      <a:off x="0" y="0"/>
+                      <a:ext cx="6096000" cy="5495925"/>
+                    </a:xfrm>
+                    <a:prstGeom prst="rect">
+                      <a:avLst/>
+                    </a:prstGeom>
+                  </pic:spPr>
+                </pic:pic>
+              </a:graphicData>
+            </a:graphic>
+          </wp:inline>
+        </w:drawing>
+      </w:r>
+    </w:p>
+    <w:p>
+      <w:pPr>
+        <w:spacing w:after="200"/>
+        <w:jc w:val="center"/>
+      </w:pPr>
+      <w:r>
+        <w:rPr>
+          <w:i/>
+          <w:iCs/>
+          <w:color w:val="595959"/>
+          <w:sz w:val="18"/>
+          <w:szCs w:val="18"/>
+        </w:rPr>
+        <w:t xml:space="preserve">Figura 7. Error no controlado.</w:t>
+      </w:r>
+    </w:p>
+    <w:p>
+      <w:pPr>
+        <w:pStyle w:val="Heading2"/>
+      </w:pPr>
+      <w:r>
+        <w:t xml:space="preserve">4.3 Diagramas de estados</w:t>
+      </w:r>
+    </w:p>
+    <w:p>
+      <w:pPr>
+        <w:spacing w:after="120" w:line="276"/>
+      </w:pPr>
+      <w:r>
+        <w:t xml:space="preserve">Las entidades maestras (categorías, productos, proveedores, etc.) solo tienen un indicador activo/inactivo. Las ventas y compras no tienen ciclo de vida: se registran una vez. Los únicos ciclos relevantes son los de la oferta y el del usuario con su sesión.</w:t>
+      </w:r>
+    </w:p>
+    <w:p>
+      <w:pPr>
+        <w:keepNext/>
+        <w:spacing w:after="60" w:before="120"/>
+        <w:jc w:val="center"/>
+      </w:pPr>
+      <w:r>
+        <w:drawing>
+          <wp:inline distT="0" distB="0" distL="0" distR="0">
+            <wp:extent cx="5667375" cy="4572000"/>
+            <wp:effectExtent t="0" r="0" b="0" l="0"/>
+            <wp:docPr id="1" name="" descr="" title=""/>
+            <wp:cNvGraphicFramePr>
+              <a:graphicFrameLocks xmlns:a="http://schemas.openxmlformats.org/drawingml/2006/main" noChangeAspect="1"/>
+            </wp:cNvGraphicFramePr>
+            <a:graphic xmlns:a="http://schemas.openxmlformats.org/drawingml/2006/main">
+              <a:graphicData uri="http://schemas.openxmlformats.org/drawingml/2006/picture">
+                <pic:pic xmlns:pic="http://schemas.openxmlformats.org/drawingml/2006/picture">
+                  <pic:nvPicPr>
+                    <pic:cNvPr id="0" name="" descr=""/>
+                    <pic:cNvPicPr>
+                      <a:picLocks noChangeAspect="1" noChangeArrowheads="1"/>
+                    </pic:cNvPicPr>
+                  </pic:nvPicPr>
+                  <pic:blipFill>
+                    <a:blip r:embed="rId16" cstate="none"/>
+                    <a:srcRect/>
+                    <a:stretch>
+                      <a:fillRect/>
+                    </a:stretch>
+                  </pic:blipFill>
+                  <pic:spPr bwMode="auto">
+                    <a:xfrm>
+                      <a:off x="0" y="0"/>
+                      <a:ext cx="5667375" cy="4572000"/>
+                    </a:xfrm>
+                    <a:prstGeom prst="rect">
+                      <a:avLst/>
+                    </a:prstGeom>
+                  </pic:spPr>
+                </pic:pic>
+              </a:graphicData>
+            </a:graphic>
+          </wp:inline>
+        </w:drawing>
+      </w:r>
+    </w:p>
+    <w:p>
+      <w:pPr>
+        <w:spacing w:after="200"/>
+        <w:jc w:val="center"/>
+      </w:pPr>
+      <w:r>
+        <w:rPr>
+          <w:i/>
+          <w:iCs/>
+          <w:color w:val="595959"/>
+          <w:sz w:val="18"/>
+          <w:szCs w:val="18"/>
+        </w:rPr>
+        <w:t xml:space="preserve">Figura 8. Estados de una oferta.</w:t>
+      </w:r>
+    </w:p>
+    <w:p>
+      <w:pPr>
+        <w:keepNext/>
+        <w:spacing w:after="60" w:before="120"/>
+        <w:jc w:val="center"/>
+      </w:pPr>
+      <w:r>
+        <w:drawing>
+          <wp:inline distT="0" distB="0" distL="0" distR="0">
+            <wp:extent cx="6096000" cy="4000500"/>
+            <wp:effectExtent t="0" r="0" b="0" l="0"/>
+            <wp:docPr id="1" name="" descr="" title=""/>
+            <wp:cNvGraphicFramePr>
+              <a:graphicFrameLocks xmlns:a="http://schemas.openxmlformats.org/drawingml/2006/main" noChangeAspect="1"/>
+            </wp:cNvGraphicFramePr>
+            <a:graphic xmlns:a="http://schemas.openxmlformats.org/drawingml/2006/main">
+              <a:graphicData uri="http://schemas.openxmlformats.org/drawingml/2006/picture">
+                <pic:pic xmlns:pic="http://schemas.openxmlformats.org/drawingml/2006/picture">
+                  <pic:nvPicPr>
+                    <pic:cNvPr id="0" name="" descr=""/>
+                    <pic:cNvPicPr>
+                      <a:picLocks noChangeAspect="1" noChangeArrowheads="1"/>
+                    </pic:cNvPicPr>
+                  </pic:nvPicPr>
+                  <pic:blipFill>
+                    <a:blip r:embed="rId17" cstate="none"/>
+                    <a:srcRect/>
+                    <a:stretch>
+                      <a:fillRect/>
+                    </a:stretch>
+                  </pic:blipFill>
+                  <pic:spPr bwMode="auto">
+                    <a:xfrm>
+                      <a:off x="0" y="0"/>
+                      <a:ext cx="6096000" cy="4000500"/>
+                    </a:xfrm>
+                    <a:prstGeom prst="rect">
+                      <a:avLst/>
+                    </a:prstGeom>
+                  </pic:spPr>
+                </pic:pic>
+              </a:graphicData>
+            </a:graphic>
+          </wp:inline>
+        </w:drawing>
+      </w:r>
+    </w:p>
+    <w:p>
+      <w:pPr>
+        <w:spacing w:after="200"/>
+        <w:jc w:val="center"/>
+      </w:pPr>
+      <w:r>
+        <w:rPr>
+          <w:i/>
+          <w:iCs/>
+          <w:color w:val="595959"/>
+          <w:sz w:val="18"/>
+          <w:szCs w:val="18"/>
+        </w:rPr>
+        <w:t xml:space="preserve">Figura 9. Estados del usuario y de la sesión.</w:t>
+      </w:r>
+    </w:p>
+    <w:p>
+      <w:pPr>
+        <w:pStyle w:val="Heading2"/>
+      </w:pPr>
+      <w:r>
+        <w:t xml:space="preserve">4.4 Actualizar los diagramas</w:t>
+      </w:r>
+    </w:p>
+    <w:p>
+      <w:pPr>
+        <w:spacing w:after="120" w:line="276"/>
+      </w:pPr>
+      <w:r>
+        <w:t xml:space="preserve">Con Java instalado y el archivo </w:t>
+      </w:r>
+      <w:r>
+        <w:rPr>
+          <w:rFonts w:ascii="Consolas" w:cs="Consolas" w:eastAsia="Consolas" w:hAnsi="Consolas"/>
+          <w:color w:val="7A2E0E"/>
+          <w:sz w:val="19"/>
+          <w:szCs w:val="19"/>
+        </w:rPr>
+        <w:t xml:space="preserve">plantuml.jar</w:t>
+      </w:r>
+      <w:r>
+        <w:t xml:space="preserve"> descargado desde plantuml.com, ejecute desde </w:t>
+      </w:r>
+      <w:r>
+        <w:rPr>
+          <w:rFonts w:ascii="Consolas" w:cs="Consolas" w:eastAsia="Consolas" w:hAnsi="Consolas"/>
+          <w:color w:val="7A2E0E"/>
+          <w:sz w:val="19"/>
+          <w:szCs w:val="19"/>
+        </w:rPr>
+        <w:t xml:space="preserve">Docs/diagramas</w:t>
+      </w:r>
+      <w:r>
+        <w:t xml:space="preserve">:</w:t>
+      </w:r>
+    </w:p>
+    <w:p>
+      <w:pPr>
+        <w:shd w:fill="F2F2F2" w:color="auto" w:val="clear"/>
+        <w:spacing w:after="160" w:line="240"/>
+        <w:ind w:left="200" w:right="200"/>
+      </w:pPr>
+      <w:r>
+        <w:rPr>
+          <w:rFonts w:ascii="Consolas" w:cs="Consolas" w:eastAsia="Consolas" w:hAnsi="Consolas"/>
+          <w:sz w:val="18"/>
+          <w:szCs w:val="18"/>
+        </w:rPr>
+        <w:t xml:space="preserve">java -jar plantuml.jar -charset UTF-8 -tpng -Sdpi=200 -o png [!_]*.puml</w:t>
+      </w:r>
+    </w:p>
+    <w:p>
+      <w:pPr>
+        <w:spacing w:after="120" w:line="276"/>
+      </w:pPr>
+      <w:r>
+        <w:t xml:space="preserve">El archivo </w:t>
+      </w:r>
+      <w:r>
+        <w:rPr>
+          <w:rFonts w:ascii="Consolas" w:cs="Consolas" w:eastAsia="Consolas" w:hAnsi="Consolas"/>
+          <w:color w:val="7A2E0E"/>
+          <w:sz w:val="19"/>
+          <w:szCs w:val="19"/>
+        </w:rPr>
+        <w:t xml:space="preserve">_estilo.iuml</w:t>
+      </w:r>
+      <w:r>
+        <w:t xml:space="preserve"> define colores y fuentes comunes; los diagramas de clases y estados usan el motor de diseño interno (</w:t>
+      </w:r>
+      <w:r>
+        <w:rPr>
+          <w:rFonts w:ascii="Consolas" w:cs="Consolas" w:eastAsia="Consolas" w:hAnsi="Consolas"/>
+          <w:color w:val="7A2E0E"/>
+          <w:sz w:val="19"/>
+          <w:szCs w:val="19"/>
+        </w:rPr>
+        <w:t xml:space="preserve">!pragma layout smetana</w:t>
+      </w:r>
+      <w:r>
+        <w:t xml:space="preserve">), por lo que no requieren Graphviz. También puede usarse la extensión PlantUML de Visual Studio Code para previsualizarlos.</w:t>
+      </w:r>
+    </w:p>
+    <w:p>
+      <w:pPr>
+        <w:pStyle w:val="Heading1"/>
+        <w:pageBreakBefore/>
+      </w:pPr>
+      <w:r>
+        <w:t xml:space="preserve">5. Base de datos</w:t>
+      </w:r>
+    </w:p>
+    <w:p>
+      <w:pPr>
+        <w:pStyle w:val="Heading2"/>
+      </w:pPr>
+      <w:r>
+        <w:t xml:space="preserve">5.1 Generalidades</w:t>
+      </w:r>
+    </w:p>
+    <w:p>
+      <w:pPr>
+        <w:spacing w:after="120" w:line="276"/>
+      </w:pPr>
+      <w:r>
         <w:t xml:space="preserve">La base </w:t>
       </w:r>
       <w:r>
@@ -3162,7 +4065,7 @@
         <w:pStyle w:val="Heading2"/>
       </w:pPr>
       <w:r>
-        <w:t xml:space="preserve">4.2 Tablas</w:t>
+        <w:t xml:space="preserve">5.2 Tablas</w:t>
       </w:r>
     </w:p>
     <w:tbl>
@@ -5283,7 +6186,7 @@
         <w:pStyle w:val="Heading2"/>
       </w:pPr>
       <w:r>
-        <w:t xml:space="preserve">4.3 Procedimientos almacenados</w:t>
+        <w:t xml:space="preserve">5.3 Procedimientos almacenados</w:t>
       </w:r>
     </w:p>
     <w:p>
@@ -5975,7 +6878,43 @@
         <w:t xml:space="preserve">PA_REGISTRAR_VENTA</w:t>
       </w:r>
       <w:r>
-        <w:t xml:space="preserve">: registran cabecera y detalle en una transacción. La venta valida stock (lanza «Stock insuficiente…») y lo descuenta; la compra lo incrementa.</w:t>
+        <w:t xml:space="preserve">: registran cabecera y detalle en una transacción y devuelven </w:t>
+      </w:r>
+      <w:r>
+        <w:rPr>
+          <w:rFonts w:ascii="Consolas" w:cs="Consolas" w:eastAsia="Consolas" w:hAnsi="Consolas"/>
+          <w:color w:val="7A2E0E"/>
+          <w:sz w:val="19"/>
+          <w:szCs w:val="19"/>
+        </w:rPr>
+        <w:t xml:space="preserve">@RESULTADO</w:t>
+      </w:r>
+      <w:r>
+        <w:t xml:space="preserve"> (1 = éxito, 0 = fallo). La compra suma stock y actualiza precios; la venta valida y descuenta stock. Si falta stock, el </w:t>
+      </w:r>
+      <w:r>
+        <w:rPr>
+          <w:rFonts w:ascii="Consolas" w:cs="Consolas" w:eastAsia="Consolas" w:hAnsi="Consolas"/>
+          <w:color w:val="7A2E0E"/>
+          <w:sz w:val="19"/>
+          <w:szCs w:val="19"/>
+        </w:rPr>
+        <w:t xml:space="preserve">RAISERROR</w:t>
+      </w:r>
+      <w:r>
+        <w:t xml:space="preserve"> cae en el </w:t>
+      </w:r>
+      <w:r>
+        <w:rPr>
+          <w:rFonts w:ascii="Consolas" w:cs="Consolas" w:eastAsia="Consolas" w:hAnsi="Consolas"/>
+          <w:color w:val="7A2E0E"/>
+          <w:sz w:val="19"/>
+          <w:szCs w:val="19"/>
+        </w:rPr>
+        <w:t xml:space="preserve">CATCH</w:t>
+      </w:r>
+      <w:r>
+        <w:t xml:space="preserve">, se hace rollback y la API responde «Error al registrar.» sin indicar la causa.</w:t>
       </w:r>
     </w:p>
     <w:p>
@@ -5997,7 +6936,7 @@
         <w:t xml:space="preserve">PA_ACTUALIZAR_ESTADO_OFERTAS</w:t>
       </w:r>
       <w:r>
-        <w:t xml:space="preserve">: actualiza el estado de las ofertas según su vigencia.</w:t>
+        <w:t xml:space="preserve">: desactiva las ofertas activas cuya fecha de fin ya pasó. La API no lo invoca; debe programarse como job de SQL Server Agent (por ejemplo, diario a las 00:05) o ejecutarse manualmente.</w:t>
       </w:r>
     </w:p>
     <w:p>
@@ -6160,7 +7099,7 @@
         <w:pStyle w:val="Heading2"/>
       </w:pPr>
       <w:r>
-        <w:t xml:space="preserve">4.4 Tipos tabla y trigger</w:t>
+        <w:t xml:space="preserve">5.4 Tipos tabla y trigger</w:t>
       </w:r>
     </w:p>
     <w:p>
@@ -6237,7 +7176,7 @@
         <w:pageBreakBefore/>
       </w:pPr>
       <w:r>
-        <w:t xml:space="preserve">5. API REST</w:t>
+        <w:t xml:space="preserve">6. API REST</w:t>
       </w:r>
     </w:p>
     <w:p>
@@ -6245,7 +7184,7 @@
         <w:pStyle w:val="Heading2"/>
       </w:pPr>
       <w:r>
-        <w:t xml:space="preserve">5.1 Convenciones generales</w:t>
+        <w:t xml:space="preserve">6.1 Convenciones generales</w:t>
       </w:r>
     </w:p>
     <w:p>
@@ -6438,7 +7377,7 @@
         <w:pStyle w:val="Heading2"/>
       </w:pPr>
       <w:r>
-        <w:t xml:space="preserve">5.2 Estructura de respuesta</w:t>
+        <w:t xml:space="preserve">6.2 Estructura de respuesta</w:t>
       </w:r>
     </w:p>
     <w:p>
@@ -6862,7 +7801,7 @@
                 <w:sz w:val="19"/>
                 <w:szCs w:val="19"/>
               </w:rPr>
-              <w:t xml:space="preserve">Se superó el límite de peticiones (ver sección 6.4).</w:t>
+              <w:t xml:space="preserve">Se superó el límite de peticiones (ver sección 7.4).</w:t>
             </w:r>
           </w:p>
         </w:tc>
@@ -6932,7 +7871,7 @@
         <w:pStyle w:val="Heading2"/>
       </w:pPr>
       <w:r>
-        <w:t xml:space="preserve">5.3 Autenticación y usuarios</w:t>
+        <w:t xml:space="preserve">6.3 Autenticación y usuarios</w:t>
       </w:r>
     </w:p>
     <w:tbl>
@@ -7861,7 +8800,7 @@
         <w:pStyle w:val="Heading2"/>
       </w:pPr>
       <w:r>
-        <w:t xml:space="preserve">5.4 Catálogo y terceros</w:t>
+        <w:t xml:space="preserve">6.4 Catálogo y terceros</w:t>
       </w:r>
     </w:p>
     <w:p>
@@ -8579,7 +9518,7 @@
         <w:pStyle w:val="Heading2"/>
       </w:pPr>
       <w:r>
-        <w:t xml:space="preserve">5.5 Compras y ventas</w:t>
+        <w:t xml:space="preserve">6.5 Compras y ventas</w:t>
       </w:r>
     </w:p>
     <w:tbl>
@@ -9345,7 +10284,7 @@
         <w:pStyle w:val="Heading2"/>
       </w:pPr>
       <w:r>
-        <w:t xml:space="preserve">5.6 Negocio, reportes y auditoría</w:t>
+        <w:t xml:space="preserve">6.6 Negocio, reportes y auditoría</w:t>
       </w:r>
     </w:p>
     <w:tbl>
@@ -10175,7 +11114,7 @@
                 <w:sz w:val="19"/>
                 <w:szCs w:val="19"/>
               </w:rPr>
-              <w:t xml:space="preserve">Análisis en lenguaje natural con IA (ver sección 8)</w:t>
+              <w:t xml:space="preserve">Análisis en lenguaje natural con IA (ver sección 9)</w:t>
             </w:r>
           </w:p>
         </w:tc>
@@ -10352,7 +11291,7 @@
         <w:pageBreakBefore/>
       </w:pPr>
       <w:r>
-        <w:t xml:space="preserve">6. Seguridad</w:t>
+        <w:t xml:space="preserve">7. Seguridad</w:t>
       </w:r>
     </w:p>
     <w:p>
@@ -10360,7 +11299,7 @@
         <w:pStyle w:val="Heading2"/>
       </w:pPr>
       <w:r>
-        <w:t xml:space="preserve">6.1 Autenticación JWT</w:t>
+        <w:t xml:space="preserve">7.1 Autenticación JWT</w:t>
       </w:r>
     </w:p>
     <w:p>
@@ -10876,7 +11815,7 @@
         <w:pStyle w:val="Heading2"/>
       </w:pPr>
       <w:r>
-        <w:t xml:space="preserve">6.2 Autorización</w:t>
+        <w:t xml:space="preserve">7.2 Autorización</w:t>
       </w:r>
     </w:p>
     <w:p>
@@ -10904,7 +11843,7 @@
         <w:pStyle w:val="Heading2"/>
       </w:pPr>
       <w:r>
-        <w:t xml:space="preserve">6.3 Contraseñas</w:t>
+        <w:t xml:space="preserve">7.3 Contraseñas</w:t>
       </w:r>
     </w:p>
     <w:p>
@@ -10932,7 +11871,7 @@
         <w:pStyle w:val="Heading2"/>
       </w:pPr>
       <w:r>
-        <w:t xml:space="preserve">6.4 Rate limiting y CORS</w:t>
+        <w:t xml:space="preserve">7.4 Rate limiting y CORS</w:t>
       </w:r>
     </w:p>
     <w:p>
@@ -10966,7 +11905,7 @@
         <w:pStyle w:val="Heading2"/>
       </w:pPr>
       <w:r>
-        <w:t xml:space="preserve">6.5 Observaciones y recomendaciones</w:t>
+        <w:t xml:space="preserve">7.5 Observaciones y recomendaciones</w:t>
       </w:r>
     </w:p>
     <w:p>
@@ -11075,7 +12014,7 @@
         <w:pageBreakBefore/>
       </w:pPr>
       <w:r>
-        <w:t xml:space="preserve">7. Auditoría y manejo de errores</w:t>
+        <w:t xml:space="preserve">8. Auditoría y manejo de errores</w:t>
       </w:r>
     </w:p>
     <w:p>
@@ -11083,7 +12022,7 @@
         <w:pStyle w:val="Heading2"/>
       </w:pPr>
       <w:r>
-        <w:t xml:space="preserve">7.1 Servicio de auditoría</w:t>
+        <w:t xml:space="preserve">8.1 Servicio de auditoría</w:t>
       </w:r>
     </w:p>
     <w:p>
@@ -11631,7 +12570,7 @@
         <w:pStyle w:val="Heading2"/>
       </w:pPr>
       <w:r>
-        <w:t xml:space="preserve">7.2 Middleware global</w:t>
+        <w:t xml:space="preserve">8.2 Middleware global</w:t>
       </w:r>
     </w:p>
     <w:p>
@@ -11687,7 +12626,7 @@
         <w:pageBreakBefore/>
       </w:pPr>
       <w:r>
-        <w:t xml:space="preserve">8. Integración con IA (Ollama)</w:t>
+        <w:t xml:space="preserve">9. Integración con IA (Ollama)</w:t>
       </w:r>
     </w:p>
     <w:p>
@@ -12304,7 +13243,7 @@
         <w:pageBreakBefore/>
       </w:pPr>
       <w:r>
-        <w:t xml:space="preserve">9. Configuración</w:t>
+        <w:t xml:space="preserve">10. Configuración</w:t>
       </w:r>
     </w:p>
     <w:p>
@@ -12312,7 +13251,7 @@
         <w:pStyle w:val="Heading2"/>
       </w:pPr>
       <w:r>
-        <w:t xml:space="preserve">9.1 appsettings.json</w:t>
+        <w:t xml:space="preserve">10.1 appsettings.json</w:t>
       </w:r>
     </w:p>
     <w:tbl>
@@ -12918,7 +13857,7 @@
         <w:pStyle w:val="Heading2"/>
       </w:pPr>
       <w:r>
-        <w:t xml:space="preserve">9.2 Variables de entorno</w:t>
+        <w:t xml:space="preserve">10.2 Variables de entorno</w:t>
       </w:r>
     </w:p>
     <w:tbl>
@@ -13274,7 +14213,7 @@
         <w:pageBreakBefore/>
       </w:pPr>
       <w:r>
-        <w:t xml:space="preserve">10. Instalación, ejecución y despliegue</w:t>
+        <w:t xml:space="preserve">11. Instalación, ejecución y despliegue</w:t>
       </w:r>
     </w:p>
     <w:p>
@@ -13282,7 +14221,7 @@
         <w:pStyle w:val="Heading2"/>
       </w:pPr>
       <w:r>
-        <w:t xml:space="preserve">10.1 Ejecución local</w:t>
+        <w:t xml:space="preserve">11.1 Ejecución local</w:t>
       </w:r>
     </w:p>
     <w:p>
@@ -13469,7 +14408,7 @@
         <w:pStyle w:val="Heading2"/>
       </w:pPr>
       <w:r>
-        <w:t xml:space="preserve">10.2 Docker Compose</w:t>
+        <w:t xml:space="preserve">11.2 Docker Compose</w:t>
       </w:r>
     </w:p>
     <w:p>
@@ -13905,7 +14844,7 @@
         <w:pStyle w:val="Heading2"/>
       </w:pPr>
       <w:r>
-        <w:t xml:space="preserve">10.3 Publicación en IIS / Azure</w:t>
+        <w:t xml:space="preserve">11.3 Publicación en IIS / Azure</w:t>
       </w:r>
     </w:p>
     <w:p>
@@ -13949,7 +14888,7 @@
         <w:pageBreakBefore/>
       </w:pPr>
       <w:r>
-        <w:t xml:space="preserve">11. Pruebas e integración continua</w:t>
+        <w:t xml:space="preserve">12. Pruebas e integración continua</w:t>
       </w:r>
     </w:p>
     <w:p>
@@ -13957,7 +14896,7 @@
         <w:pStyle w:val="Heading2"/>
       </w:pPr>
       <w:r>
-        <w:t xml:space="preserve">11.1 Pruebas unitarias</w:t>
+        <w:t xml:space="preserve">12.1 Pruebas unitarias</w:t>
       </w:r>
     </w:p>
     <w:p>
@@ -14074,7 +15013,7 @@
         <w:pStyle w:val="Heading2"/>
       </w:pPr>
       <w:r>
-        <w:t xml:space="preserve">11.2 GitHub Actions</w:t>
+        <w:t xml:space="preserve">12.2 GitHub Actions</w:t>
       </w:r>
     </w:p>
     <w:p>
@@ -14151,7 +15090,7 @@
         <w:pageBreakBefore/>
       </w:pPr>
       <w:r>
-        <w:t xml:space="preserve">12. Mantenimiento y extensión</w:t>
+        <w:t xml:space="preserve">13. Mantenimiento y extensión</w:t>
       </w:r>
     </w:p>
     <w:p>
@@ -14159,7 +15098,7 @@
         <w:pStyle w:val="Heading2"/>
       </w:pPr>
       <w:r>
-        <w:t xml:space="preserve">12.1 Agregar un nuevo módulo</w:t>
+        <w:t xml:space="preserve">13.1 Agregar un nuevo módulo</w:t>
       </w:r>
     </w:p>
     <w:p>
@@ -14425,7 +15364,7 @@
         <w:pStyle w:val="Heading2"/>
       </w:pPr>
       <w:r>
-        <w:t xml:space="preserve">12.2 Buenas prácticas</w:t>
+        <w:t xml:space="preserve">13.2 Buenas prácticas</w:t>
       </w:r>
     </w:p>
     <w:p>

</xml_diff>